<commit_message>
Fix M5-002 download pack under GitHub limit v8.3.7
</commit_message>
<xml_diff>
--- a/resources/mathematics/M5-002/worksheets/Работен лист 2_Денят на числото Пи.docx
+++ b/resources/mathematics/M5-002/worksheets/Работен лист 2_Денят на числото Пи.docx
@@ -80,7 +80,6 @@
     </w:p>
     <w:sectPr>
       <w:headerReference w:type="default" r:id="rId8"/>
-      <w:footerReference w:type="default" r:id="rId12"/>
       <w:type w:val="continuous"/>
       <w:pgSz w:w="11906" w:h="16838"/>
       <w:pgMar w:top="709" w:right="566" w:bottom="851" w:left="851" w:header="708" w:footer="708" w:gutter="0"/>
@@ -114,51 +113,6 @@
     </w:p>
   </w:endnote>
 </w:endnotes>
-</file>
-
-<file path=word/footer1.xml><?xml version="1.0" encoding="utf-8"?>
-<w:ftr xmlns:m="http://schemas.openxmlformats.org/officeDocument/2006/math" xmlns:mc="http://schemas.openxmlformats.org/markup-compatibility/2006" xmlns:mo="http://schemas.microsoft.com/office/mac/office/2008/main" xmlns:mv="urn:schemas-microsoft-com:mac:vml" xmlns:o="urn:schemas-microsoft-com:office:office" xmlns:r="http://schemas.openxmlformats.org/officeDocument/2006/relationships" xmlns:v="urn:schemas-microsoft-com:vml" xmlns:w10="urn:schemas-microsoft-com:office:word" xmlns:w14="http://schemas.microsoft.com/office/word/2010/wordml" xmlns:w="http://schemas.openxmlformats.org/wordprocessingml/2006/main" xmlns:wne="http://schemas.microsoft.com/office/word/2006/wordml" xmlns:wp14="http://schemas.microsoft.com/office/word/2010/wordprocessingDrawing" xmlns:wp="http://schemas.openxmlformats.org/drawingml/2006/wordprocessingDrawing" xmlns:wpc="http://schemas.microsoft.com/office/word/2010/wordprocessingCanvas" xmlns:wpg="http://schemas.microsoft.com/office/word/2010/wordprocessingGroup" xmlns:wpi="http://schemas.microsoft.com/office/word/2010/wordprocessingInk" xmlns:wps="http://schemas.microsoft.com/office/word/2010/wordprocessingShape" mc:Ignorable="w14 wp14">
-  <w:p>
-    <w:pPr>
-      <w:pStyle w:val="Footer"/>
-      <w:jc w:val="right"/>
-    </w:pPr>
-    <w:r>
-      <w:drawing>
-        <wp:inline xmlns:a="http://schemas.openxmlformats.org/drawingml/2006/main" xmlns:pic="http://schemas.openxmlformats.org/drawingml/2006/picture">
-          <wp:extent cx="1005840" cy="1048232"/>
-          <wp:docPr id="1" name="Picture 1"/>
-          <wp:cNvGraphicFramePr>
-            <a:graphicFrameLocks noChangeAspect="1"/>
-          </wp:cNvGraphicFramePr>
-          <a:graphic>
-            <a:graphicData uri="http://schemas.openxmlformats.org/drawingml/2006/picture">
-              <pic:pic>
-                <pic:nvPicPr>
-                  <pic:cNvPr id="0" name="em-logo.png"/>
-                  <pic:cNvPicPr/>
-                </pic:nvPicPr>
-                <pic:blipFill>
-                  <a:blip r:embed="rId1"/>
-                  <a:stretch>
-                    <a:fillRect/>
-                  </a:stretch>
-                </pic:blipFill>
-                <pic:spPr>
-                  <a:xfrm>
-                    <a:off x="0" y="0"/>
-                    <a:ext cx="1005840" cy="1048232"/>
-                  </a:xfrm>
-                  <a:prstGeom prst="rect"/>
-                </pic:spPr>
-              </pic:pic>
-            </a:graphicData>
-          </a:graphic>
-        </wp:inline>
-      </w:drawing>
-    </w:r>
-  </w:p>
-</w:ftr>
 </file>
 
 <file path=word/footnotes.xml><?xml version="1.0" encoding="utf-8"?>

</xml_diff>